<commit_message>
Trabalho do segundo semestre revisto
</commit_message>
<xml_diff>
--- a/referencias/atividades-e-provas/orientacao-trabalho-analise-de-filme.docx
+++ b/referencias/atividades-e-provas/orientacao-trabalho-analise-de-filme.docx
@@ -41,17 +41,17 @@
     </w:p>
     <w:tbl>
       <w:tblPr>
-        <w:tblW w:type="auto" w:w="0"/>
+        <w:tblW w:w="0" w:type="auto"/>
+        <w:tblBorders>
+          <w:top w:val="single" w:sz="4" w:space="0" w:color="BFBFBF"/>
+          <w:left w:val="single" w:sz="4" w:space="0" w:color="BFBFBF"/>
+          <w:bottom w:val="single" w:sz="4" w:space="0" w:color="BFBFBF"/>
+          <w:right w:val="single" w:sz="4" w:space="0" w:color="BFBFBF"/>
+          <w:insideH w:val="single" w:sz="4" w:space="0" w:color="BFBFBF"/>
+          <w:insideV w:val="single" w:sz="4" w:space="0" w:color="BFBFBF"/>
+        </w:tblBorders>
         <w:tblLayout w:type="fixed"/>
-        <w:tblLook w:firstColumn="1" w:firstRow="1" w:lastColumn="0" w:lastRow="0" w:noHBand="0" w:noVBand="1" w:val="04A0"/>
-        <w:tblBorders>
-          <w:top w:val="single" w:sz="4" w:color="BFBFBF"/>
-          <w:left w:val="single" w:sz="4" w:color="BFBFBF"/>
-          <w:bottom w:val="single" w:sz="4" w:color="BFBFBF"/>
-          <w:right w:val="single" w:sz="4" w:color="BFBFBF"/>
-          <w:insideH w:val="single" w:sz="4" w:color="BFBFBF"/>
-          <w:insideV w:val="single" w:sz="4" w:color="BFBFBF"/>
-        </w:tblBorders>
+        <w:tblLook w:val="04A0" w:firstRow="1" w:lastRow="0" w:firstColumn="1" w:lastColumn="0" w:noHBand="0" w:noVBand="1"/>
       </w:tblPr>
       <w:tblGrid>
         <w:gridCol w:w="2268"/>
@@ -63,35 +63,29 @@
         </w:trPr>
         <w:tc>
           <w:tcPr>
-            <w:tcW w:type="dxa" w:w="2268"/>
+            <w:tcW w:w="2268" w:type="dxa"/>
             <w:shd w:val="clear" w:color="auto" w:fill="EAF1F8"/>
           </w:tcPr>
           <w:p>
             <w:pPr>
               <w:keepNext/>
-              <w:spacing w:after="40" w:before="40"/>
-            </w:pPr>
-            <w:r>
-              <w:rPr>
-                <w:sz w:val="22"/>
-              </w:rPr>
+              <w:spacing w:before="40" w:after="40"/>
+            </w:pPr>
+            <w:r>
               <w:t>Formato</w:t>
             </w:r>
           </w:p>
         </w:tc>
         <w:tc>
           <w:tcPr>
-            <w:tcW w:type="dxa" w:w="6746"/>
-          </w:tcPr>
-          <w:p>
-            <w:pPr>
-              <w:keepNext/>
-              <w:spacing w:after="40" w:before="40"/>
-            </w:pPr>
-            <w:r>
-              <w:rPr>
-                <w:sz w:val="22"/>
-              </w:rPr>
+            <w:tcW w:w="6746" w:type="dxa"/>
+          </w:tcPr>
+          <w:p>
+            <w:pPr>
+              <w:keepNext/>
+              <w:spacing w:before="40" w:after="40"/>
+            </w:pPr>
+            <w:r>
               <w:t>Grupo de 3 a 5 integrantes</w:t>
             </w:r>
           </w:p>
@@ -103,36 +97,30 @@
         </w:trPr>
         <w:tc>
           <w:tcPr>
-            <w:tcW w:type="dxa" w:w="2268"/>
+            <w:tcW w:w="2268" w:type="dxa"/>
             <w:shd w:val="clear" w:color="auto" w:fill="EAF1F8"/>
           </w:tcPr>
           <w:p>
             <w:pPr>
               <w:keepNext/>
-              <w:spacing w:after="40" w:before="40"/>
-            </w:pPr>
-            <w:r>
-              <w:rPr>
-                <w:sz w:val="22"/>
-              </w:rPr>
+              <w:spacing w:before="40" w:after="40"/>
+            </w:pPr>
+            <w:r>
               <w:t>Extensão</w:t>
             </w:r>
           </w:p>
         </w:tc>
         <w:tc>
           <w:tcPr>
-            <w:tcW w:type="dxa" w:w="6746"/>
-          </w:tcPr>
-          <w:p>
-            <w:pPr>
-              <w:keepNext/>
-              <w:spacing w:after="40" w:before="40"/>
-            </w:pPr>
-            <w:r>
-              <w:rPr>
-                <w:sz w:val="22"/>
-              </w:rPr>
-              <w:t>5 a 8 páginas, sem contar capa e referências</w:t>
+            <w:tcW w:w="6746" w:type="dxa"/>
+          </w:tcPr>
+          <w:p>
+            <w:pPr>
+              <w:keepNext/>
+              <w:spacing w:before="40" w:after="40"/>
+            </w:pPr>
+            <w:r>
+              <w:t>5 a 8 páginas</w:t>
             </w:r>
           </w:p>
         </w:tc>
@@ -143,35 +131,29 @@
         </w:trPr>
         <w:tc>
           <w:tcPr>
-            <w:tcW w:type="dxa" w:w="2268"/>
+            <w:tcW w:w="2268" w:type="dxa"/>
             <w:shd w:val="clear" w:color="auto" w:fill="EAF1F8"/>
           </w:tcPr>
           <w:p>
             <w:pPr>
               <w:keepNext/>
-              <w:spacing w:after="40" w:before="40"/>
-            </w:pPr>
-            <w:r>
-              <w:rPr>
-                <w:sz w:val="22"/>
-              </w:rPr>
+              <w:spacing w:before="40" w:after="40"/>
+            </w:pPr>
+            <w:r>
               <w:t>Entrega</w:t>
             </w:r>
           </w:p>
         </w:tc>
         <w:tc>
           <w:tcPr>
-            <w:tcW w:type="dxa" w:w="6746"/>
-          </w:tcPr>
-          <w:p>
-            <w:pPr>
-              <w:keepNext/>
-              <w:spacing w:after="40" w:before="40"/>
-            </w:pPr>
-            <w:r>
-              <w:rPr>
-                <w:sz w:val="22"/>
-              </w:rPr>
+            <w:tcW w:w="6746" w:type="dxa"/>
+          </w:tcPr>
+          <w:p>
+            <w:pPr>
+              <w:keepNext/>
+              <w:spacing w:before="40" w:after="40"/>
+            </w:pPr>
+            <w:r>
               <w:t>Digital, em PDF</w:t>
             </w:r>
           </w:p>
@@ -183,35 +165,31 @@
         </w:trPr>
         <w:tc>
           <w:tcPr>
-            <w:tcW w:type="dxa" w:w="2268"/>
+            <w:tcW w:w="2268" w:type="dxa"/>
             <w:shd w:val="clear" w:color="auto" w:fill="EAF1F8"/>
           </w:tcPr>
           <w:p>
             <w:pPr>
               <w:keepNext/>
-              <w:spacing w:after="40" w:before="40"/>
-            </w:pPr>
-            <w:r>
-              <w:rPr>
-                <w:sz w:val="22"/>
-              </w:rPr>
+              <w:spacing w:before="40" w:after="40"/>
+            </w:pPr>
+            <w:r>
               <w:t>Prazo</w:t>
             </w:r>
           </w:p>
         </w:tc>
         <w:tc>
           <w:tcPr>
-            <w:tcW w:type="dxa" w:w="6746"/>
-          </w:tcPr>
-          <w:p>
-            <w:pPr>
-              <w:keepNext/>
-              <w:spacing w:after="40" w:before="40"/>
+            <w:tcW w:w="6746" w:type="dxa"/>
+          </w:tcPr>
+          <w:p>
+            <w:pPr>
+              <w:keepNext/>
+              <w:spacing w:before="40" w:after="40"/>
             </w:pPr>
             <w:r>
               <w:rPr>
                 <w:b/>
-                <w:sz w:val="22"/>
               </w:rPr>
               <w:t>25/11/2026</w:t>
             </w:r>
@@ -224,46 +202,37 @@
         </w:trPr>
         <w:tc>
           <w:tcPr>
-            <w:tcW w:type="dxa" w:w="2268"/>
+            <w:tcW w:w="2268" w:type="dxa"/>
             <w:shd w:val="clear" w:color="auto" w:fill="EAF1F8"/>
           </w:tcPr>
           <w:p>
             <w:pPr>
-              <w:keepNext w:val="0"/>
-              <w:spacing w:after="40" w:before="40"/>
-            </w:pPr>
-            <w:r>
-              <w:rPr>
-                <w:sz w:val="22"/>
-              </w:rPr>
+              <w:spacing w:before="40" w:after="40"/>
+            </w:pPr>
+            <w:r>
               <w:t>Valor</w:t>
             </w:r>
           </w:p>
         </w:tc>
         <w:tc>
           <w:tcPr>
-            <w:tcW w:type="dxa" w:w="6746"/>
-          </w:tcPr>
-          <w:p>
-            <w:pPr>
-              <w:keepNext w:val="0"/>
-              <w:spacing w:after="40" w:before="40"/>
-            </w:pPr>
-            <w:r>
-              <w:rPr>
-                <w:sz w:val="22"/>
-              </w:rPr>
+            <w:tcW w:w="6746" w:type="dxa"/>
+          </w:tcPr>
+          <w:p>
+            <w:pPr>
+              <w:spacing w:before="40" w:after="40"/>
+            </w:pPr>
+            <w:r>
               <w:t>10 pontos</w:t>
+            </w:r>
+            <w:r>
+              <w:t xml:space="preserve"> (com peso 2 na média)</w:t>
             </w:r>
           </w:p>
         </w:tc>
       </w:tr>
     </w:tbl>
-    <w:p>
-      <w:pPr>
-        <w:spacing w:after="0"/>
-      </w:pPr>
-    </w:p>
+    <w:p/>
     <w:p>
       <w:pPr>
         <w:pStyle w:val="Ttulo1"/>
@@ -274,7 +243,7 @@
     </w:p>
     <w:p>
       <w:pPr>
-        <w:spacing w:before="0" w:after="120" w:line="300" w:lineRule="auto"/>
+        <w:spacing w:after="120" w:line="300" w:lineRule="auto"/>
         <w:jc w:val="both"/>
       </w:pPr>
       <w:r>
@@ -283,7 +252,7 @@
     </w:p>
     <w:p>
       <w:pPr>
-        <w:spacing w:before="0" w:after="120" w:line="300" w:lineRule="auto"/>
+        <w:spacing w:after="120" w:line="300" w:lineRule="auto"/>
         <w:jc w:val="both"/>
       </w:pPr>
       <w:r>
@@ -323,7 +292,7 @@
     </w:p>
     <w:p>
       <w:pPr>
-        <w:spacing w:before="0" w:after="120" w:line="300" w:lineRule="auto"/>
+        <w:spacing w:after="120" w:line="300" w:lineRule="auto"/>
         <w:jc w:val="both"/>
       </w:pPr>
       <w:r>
@@ -337,7 +306,7 @@
           <w:ilvl w:val="0"/>
           <w:numId w:val="1"/>
         </w:numPr>
-        <w:spacing w:before="0" w:after="60" w:line="300" w:lineRule="auto"/>
+        <w:spacing w:after="60" w:line="300" w:lineRule="auto"/>
         <w:jc w:val="both"/>
       </w:pPr>
       <w:r>
@@ -351,7 +320,7 @@
           <w:ilvl w:val="0"/>
           <w:numId w:val="1"/>
         </w:numPr>
-        <w:spacing w:before="0" w:after="60" w:line="300" w:lineRule="auto"/>
+        <w:spacing w:after="60" w:line="300" w:lineRule="auto"/>
         <w:jc w:val="both"/>
       </w:pPr>
       <w:r>
@@ -365,7 +334,7 @@
           <w:ilvl w:val="0"/>
           <w:numId w:val="1"/>
         </w:numPr>
-        <w:spacing w:before="0" w:after="60" w:line="300" w:lineRule="auto"/>
+        <w:spacing w:after="60" w:line="300" w:lineRule="auto"/>
         <w:jc w:val="both"/>
       </w:pPr>
       <w:r>
@@ -379,7 +348,7 @@
           <w:ilvl w:val="0"/>
           <w:numId w:val="1"/>
         </w:numPr>
-        <w:spacing w:before="0" w:after="60" w:line="300" w:lineRule="auto"/>
+        <w:spacing w:after="60" w:line="300" w:lineRule="auto"/>
         <w:jc w:val="both"/>
       </w:pPr>
       <w:r>
@@ -388,7 +357,7 @@
     </w:p>
     <w:p>
       <w:pPr>
-        <w:spacing w:before="0" w:after="200" w:line="300" w:lineRule="auto"/>
+        <w:spacing w:after="200" w:line="300" w:lineRule="auto"/>
         <w:jc w:val="both"/>
       </w:pPr>
       <w:r>
@@ -411,7 +380,7 @@
     </w:p>
     <w:p>
       <w:pPr>
-        <w:spacing w:before="0" w:after="120" w:line="300" w:lineRule="auto"/>
+        <w:spacing w:after="120" w:line="300" w:lineRule="auto"/>
         <w:jc w:val="both"/>
       </w:pPr>
       <w:r>
@@ -425,7 +394,7 @@
           <w:ilvl w:val="0"/>
           <w:numId w:val="1"/>
         </w:numPr>
-        <w:spacing w:before="0" w:after="60" w:line="300" w:lineRule="auto"/>
+        <w:spacing w:after="60" w:line="300" w:lineRule="auto"/>
         <w:jc w:val="both"/>
       </w:pPr>
       <w:r>
@@ -439,7 +408,7 @@
           <w:ilvl w:val="0"/>
           <w:numId w:val="1"/>
         </w:numPr>
-        <w:spacing w:before="0" w:after="60" w:line="300" w:lineRule="auto"/>
+        <w:spacing w:after="60" w:line="300" w:lineRule="auto"/>
         <w:jc w:val="both"/>
       </w:pPr>
       <w:r>
@@ -453,7 +422,7 @@
           <w:ilvl w:val="0"/>
           <w:numId w:val="1"/>
         </w:numPr>
-        <w:spacing w:before="0" w:after="60" w:line="300" w:lineRule="auto"/>
+        <w:spacing w:after="60" w:line="300" w:lineRule="auto"/>
         <w:jc w:val="both"/>
       </w:pPr>
       <w:r>
@@ -467,21 +436,36 @@
           <w:ilvl w:val="0"/>
           <w:numId w:val="1"/>
         </w:numPr>
-        <w:spacing w:before="0" w:after="60" w:line="300" w:lineRule="auto"/>
+        <w:spacing w:after="60" w:line="300" w:lineRule="auto"/>
         <w:jc w:val="both"/>
       </w:pPr>
       <w:r>
+        <w:lastRenderedPageBreak/>
         <w:t>O que muda no ambiente para que Truman passe a se comportar de outro jeito no fim do filme?</w:t>
       </w:r>
     </w:p>
     <w:p>
       <w:pPr>
-        <w:spacing w:before="0" w:after="120" w:line="300" w:lineRule="auto"/>
+        <w:spacing w:after="120" w:line="300" w:lineRule="auto"/>
         <w:jc w:val="both"/>
+        <w:rPr>
+          <w:b/>
+          <w:bCs/>
+        </w:rPr>
       </w:pPr>
       <w:r>
         <w:t>Os pontos de partida são sugestões, não roteiro: o grupo não precisa responder a todos, e pode analisar outras cenas.</w:t>
       </w:r>
+      <w:r>
+        <w:t xml:space="preserve"> </w:t>
+      </w:r>
+      <w:r>
+        <w:rPr>
+          <w:b/>
+          <w:bCs/>
+        </w:rPr>
+        <w:t>O trabalho não é responder a estas perguntas, servem somente como orientação.</w:t>
+      </w:r>
     </w:p>
     <w:p>
       <w:pPr>
@@ -493,7 +477,7 @@
     </w:p>
     <w:p>
       <w:pPr>
-        <w:spacing w:before="0" w:after="120" w:line="300" w:lineRule="auto"/>
+        <w:spacing w:after="120" w:line="300" w:lineRule="auto"/>
         <w:jc w:val="both"/>
       </w:pPr>
       <w:r>
@@ -502,17 +486,17 @@
     </w:p>
     <w:tbl>
       <w:tblPr>
-        <w:tblW w:type="auto" w:w="0"/>
+        <w:tblW w:w="0" w:type="auto"/>
+        <w:tblBorders>
+          <w:top w:val="single" w:sz="4" w:space="0" w:color="BFBFBF"/>
+          <w:left w:val="single" w:sz="4" w:space="0" w:color="BFBFBF"/>
+          <w:bottom w:val="single" w:sz="4" w:space="0" w:color="BFBFBF"/>
+          <w:right w:val="single" w:sz="4" w:space="0" w:color="BFBFBF"/>
+          <w:insideH w:val="single" w:sz="4" w:space="0" w:color="BFBFBF"/>
+          <w:insideV w:val="single" w:sz="4" w:space="0" w:color="BFBFBF"/>
+        </w:tblBorders>
         <w:tblLayout w:type="fixed"/>
-        <w:tblLook w:firstColumn="1" w:firstRow="1" w:lastColumn="0" w:lastRow="0" w:noHBand="0" w:noVBand="1" w:val="04A0"/>
-        <w:tblBorders>
-          <w:top w:val="single" w:sz="4" w:color="BFBFBF"/>
-          <w:left w:val="single" w:sz="4" w:color="BFBFBF"/>
-          <w:bottom w:val="single" w:sz="4" w:color="BFBFBF"/>
-          <w:right w:val="single" w:sz="4" w:color="BFBFBF"/>
-          <w:insideH w:val="single" w:sz="4" w:color="BFBFBF"/>
-          <w:insideV w:val="single" w:sz="4" w:color="BFBFBF"/>
-        </w:tblBorders>
+        <w:tblLook w:val="04A0" w:firstRow="1" w:lastRow="0" w:firstColumn="1" w:lastColumn="0" w:noHBand="0" w:noVBand="1"/>
       </w:tblPr>
       <w:tblGrid>
         <w:gridCol w:w="2948"/>
@@ -520,18 +504,18 @@
       </w:tblGrid>
       <w:tr>
         <w:trPr>
+          <w:cantSplit/>
           <w:tblHeader/>
-          <w:cantSplit/>
         </w:trPr>
         <w:tc>
           <w:tcPr>
-            <w:tcW w:type="dxa" w:w="2948"/>
+            <w:tcW w:w="2948" w:type="dxa"/>
             <w:shd w:val="clear" w:color="auto" w:fill="1F4E79"/>
           </w:tcPr>
           <w:p>
             <w:pPr>
               <w:keepNext/>
-              <w:spacing w:after="40" w:before="40"/>
+              <w:spacing w:before="40" w:after="40"/>
             </w:pPr>
             <w:r>
               <w:rPr>
@@ -545,13 +529,13 @@
         </w:tc>
         <w:tc>
           <w:tcPr>
-            <w:tcW w:type="dxa" w:w="6066"/>
+            <w:tcW w:w="6066" w:type="dxa"/>
             <w:shd w:val="clear" w:color="auto" w:fill="1F4E79"/>
           </w:tcPr>
           <w:p>
             <w:pPr>
               <w:keepNext/>
-              <w:spacing w:after="40" w:before="40"/>
+              <w:spacing w:before="40" w:after="40"/>
             </w:pPr>
             <w:r>
               <w:rPr>
@@ -570,13 +554,13 @@
         </w:trPr>
         <w:tc>
           <w:tcPr>
-            <w:tcW w:type="dxa" w:w="2948"/>
+            <w:tcW w:w="2948" w:type="dxa"/>
             <w:shd w:val="clear" w:color="auto" w:fill="EAF1F8"/>
           </w:tcPr>
           <w:p>
             <w:pPr>
               <w:keepNext/>
-              <w:spacing w:after="40" w:before="40"/>
+              <w:spacing w:before="40" w:after="40"/>
             </w:pPr>
             <w:r>
               <w:rPr>
@@ -588,12 +572,12 @@
         </w:tc>
         <w:tc>
           <w:tcPr>
-            <w:tcW w:type="dxa" w:w="6066"/>
-          </w:tcPr>
-          <w:p>
-            <w:pPr>
-              <w:keepNext/>
-              <w:spacing w:after="40" w:before="40"/>
+            <w:tcW w:w="6066" w:type="dxa"/>
+          </w:tcPr>
+          <w:p>
+            <w:pPr>
+              <w:keepNext/>
+              <w:spacing w:before="40" w:after="40"/>
             </w:pPr>
             <w:r>
               <w:rPr>
@@ -610,13 +594,13 @@
         </w:trPr>
         <w:tc>
           <w:tcPr>
-            <w:tcW w:type="dxa" w:w="2948"/>
+            <w:tcW w:w="2948" w:type="dxa"/>
             <w:shd w:val="clear" w:color="auto" w:fill="EAF1F8"/>
           </w:tcPr>
           <w:p>
             <w:pPr>
               <w:keepNext/>
-              <w:spacing w:after="40" w:before="40"/>
+              <w:spacing w:before="40" w:after="40"/>
             </w:pPr>
             <w:r>
               <w:rPr>
@@ -628,12 +612,12 @@
         </w:tc>
         <w:tc>
           <w:tcPr>
-            <w:tcW w:type="dxa" w:w="6066"/>
-          </w:tcPr>
-          <w:p>
-            <w:pPr>
-              <w:keepNext/>
-              <w:spacing w:after="40" w:before="40"/>
+            <w:tcW w:w="6066" w:type="dxa"/>
+          </w:tcPr>
+          <w:p>
+            <w:pPr>
+              <w:keepNext/>
+              <w:spacing w:before="40" w:after="40"/>
             </w:pPr>
             <w:r>
               <w:rPr>
@@ -650,13 +634,13 @@
         </w:trPr>
         <w:tc>
           <w:tcPr>
-            <w:tcW w:type="dxa" w:w="2948"/>
+            <w:tcW w:w="2948" w:type="dxa"/>
             <w:shd w:val="clear" w:color="auto" w:fill="EAF1F8"/>
           </w:tcPr>
           <w:p>
             <w:pPr>
               <w:keepNext/>
-              <w:spacing w:after="40" w:before="40"/>
+              <w:spacing w:before="40" w:after="40"/>
             </w:pPr>
             <w:r>
               <w:rPr>
@@ -668,12 +652,12 @@
         </w:tc>
         <w:tc>
           <w:tcPr>
-            <w:tcW w:type="dxa" w:w="6066"/>
-          </w:tcPr>
-          <w:p>
-            <w:pPr>
-              <w:keepNext/>
-              <w:spacing w:after="40" w:before="40"/>
+            <w:tcW w:w="6066" w:type="dxa"/>
+          </w:tcPr>
+          <w:p>
+            <w:pPr>
+              <w:keepNext/>
+              <w:spacing w:before="40" w:after="40"/>
             </w:pPr>
             <w:r>
               <w:rPr>
@@ -690,13 +674,13 @@
         </w:trPr>
         <w:tc>
           <w:tcPr>
-            <w:tcW w:type="dxa" w:w="2948"/>
+            <w:tcW w:w="2948" w:type="dxa"/>
             <w:shd w:val="clear" w:color="auto" w:fill="EAF1F8"/>
           </w:tcPr>
           <w:p>
             <w:pPr>
               <w:keepNext/>
-              <w:spacing w:after="40" w:before="40"/>
+              <w:spacing w:before="40" w:after="40"/>
             </w:pPr>
             <w:r>
               <w:rPr>
@@ -708,12 +692,12 @@
         </w:tc>
         <w:tc>
           <w:tcPr>
-            <w:tcW w:type="dxa" w:w="6066"/>
-          </w:tcPr>
-          <w:p>
-            <w:pPr>
-              <w:keepNext/>
-              <w:spacing w:after="40" w:before="40"/>
+            <w:tcW w:w="6066" w:type="dxa"/>
+          </w:tcPr>
+          <w:p>
+            <w:pPr>
+              <w:keepNext/>
+              <w:spacing w:before="40" w:after="40"/>
             </w:pPr>
             <w:r>
               <w:rPr>
@@ -730,13 +714,13 @@
         </w:trPr>
         <w:tc>
           <w:tcPr>
-            <w:tcW w:type="dxa" w:w="2948"/>
+            <w:tcW w:w="2948" w:type="dxa"/>
             <w:shd w:val="clear" w:color="auto" w:fill="EAF1F8"/>
           </w:tcPr>
           <w:p>
             <w:pPr>
               <w:keepNext/>
-              <w:spacing w:after="40" w:before="40"/>
+              <w:spacing w:before="40" w:after="40"/>
             </w:pPr>
             <w:r>
               <w:rPr>
@@ -748,12 +732,12 @@
         </w:tc>
         <w:tc>
           <w:tcPr>
-            <w:tcW w:type="dxa" w:w="6066"/>
-          </w:tcPr>
-          <w:p>
-            <w:pPr>
-              <w:keepNext/>
-              <w:spacing w:after="40" w:before="40"/>
+            <w:tcW w:w="6066" w:type="dxa"/>
+          </w:tcPr>
+          <w:p>
+            <w:pPr>
+              <w:keepNext/>
+              <w:spacing w:before="40" w:after="40"/>
             </w:pPr>
             <w:r>
               <w:rPr>
@@ -770,13 +754,13 @@
         </w:trPr>
         <w:tc>
           <w:tcPr>
-            <w:tcW w:type="dxa" w:w="2948"/>
+            <w:tcW w:w="2948" w:type="dxa"/>
             <w:shd w:val="clear" w:color="auto" w:fill="EAF1F8"/>
           </w:tcPr>
           <w:p>
             <w:pPr>
               <w:keepNext/>
-              <w:spacing w:after="40" w:before="40"/>
+              <w:spacing w:before="40" w:after="40"/>
             </w:pPr>
             <w:r>
               <w:rPr>
@@ -788,12 +772,12 @@
         </w:tc>
         <w:tc>
           <w:tcPr>
-            <w:tcW w:type="dxa" w:w="6066"/>
-          </w:tcPr>
-          <w:p>
-            <w:pPr>
-              <w:keepNext/>
-              <w:spacing w:after="40" w:before="40"/>
+            <w:tcW w:w="6066" w:type="dxa"/>
+          </w:tcPr>
+          <w:p>
+            <w:pPr>
+              <w:keepNext/>
+              <w:spacing w:before="40" w:after="40"/>
             </w:pPr>
             <w:r>
               <w:rPr>
@@ -810,13 +794,12 @@
         </w:trPr>
         <w:tc>
           <w:tcPr>
-            <w:tcW w:type="dxa" w:w="2948"/>
+            <w:tcW w:w="2948" w:type="dxa"/>
             <w:shd w:val="clear" w:color="auto" w:fill="EAF1F8"/>
           </w:tcPr>
           <w:p>
             <w:pPr>
-              <w:keepNext w:val="0"/>
-              <w:spacing w:after="40" w:before="40"/>
+              <w:spacing w:before="40" w:after="40"/>
             </w:pPr>
             <w:r>
               <w:rPr>
@@ -828,12 +811,11 @@
         </w:tc>
         <w:tc>
           <w:tcPr>
-            <w:tcW w:type="dxa" w:w="6066"/>
-          </w:tcPr>
-          <w:p>
-            <w:pPr>
-              <w:keepNext w:val="0"/>
-              <w:spacing w:after="40" w:before="40"/>
+            <w:tcW w:w="6066" w:type="dxa"/>
+          </w:tcPr>
+          <w:p>
+            <w:pPr>
+              <w:spacing w:before="40" w:after="40"/>
             </w:pPr>
             <w:r>
               <w:rPr>
@@ -845,14 +827,10 @@
         </w:tc>
       </w:tr>
     </w:tbl>
-    <w:p>
-      <w:pPr>
-        <w:spacing w:after="0"/>
-      </w:pPr>
-    </w:p>
-    <w:p>
-      <w:pPr>
-        <w:spacing w:before="0" w:after="120" w:line="300" w:lineRule="auto"/>
+    <w:p/>
+    <w:p>
+      <w:pPr>
+        <w:spacing w:after="120" w:line="300" w:lineRule="auto"/>
         <w:jc w:val="both"/>
       </w:pPr>
       <w:r>
@@ -869,7 +847,7 @@
           <w:ilvl w:val="0"/>
           <w:numId w:val="1"/>
         </w:numPr>
-        <w:spacing w:before="0" w:after="60" w:line="300" w:lineRule="auto"/>
+        <w:spacing w:after="60" w:line="300" w:lineRule="auto"/>
         <w:jc w:val="both"/>
       </w:pPr>
       <w:r>
@@ -901,7 +879,7 @@
           <w:ilvl w:val="0"/>
           <w:numId w:val="1"/>
         </w:numPr>
-        <w:spacing w:before="0" w:after="60" w:line="300" w:lineRule="auto"/>
+        <w:spacing w:after="60" w:line="300" w:lineRule="auto"/>
         <w:jc w:val="both"/>
       </w:pPr>
       <w:r>
@@ -924,7 +902,7 @@
           <w:ilvl w:val="0"/>
           <w:numId w:val="1"/>
         </w:numPr>
-        <w:spacing w:before="0" w:after="60" w:line="300" w:lineRule="auto"/>
+        <w:spacing w:after="60" w:line="300" w:lineRule="auto"/>
         <w:jc w:val="both"/>
       </w:pPr>
       <w:r>
@@ -937,7 +915,13 @@
         <w:t>definido</w:t>
       </w:r>
       <w:r>
-        <w:t xml:space="preserve"> com as palavras do grupo e com base no livro, antes de ser aplicado à cena.</w:t>
+        <w:t xml:space="preserve"> com as palavras do grupo e com base no livro, antes de ser aplicado à cena</w:t>
+      </w:r>
+      <w:r>
+        <w:t xml:space="preserve"> (não esquecer de fazer a citação)</w:t>
+      </w:r>
+      <w:r>
+        <w:t>.</w:t>
       </w:r>
     </w:p>
     <w:p>
@@ -950,17 +934,17 @@
     </w:p>
     <w:tbl>
       <w:tblPr>
-        <w:tblW w:type="auto" w:w="0"/>
+        <w:tblW w:w="0" w:type="auto"/>
+        <w:tblBorders>
+          <w:top w:val="single" w:sz="4" w:space="0" w:color="BFBFBF"/>
+          <w:left w:val="single" w:sz="4" w:space="0" w:color="BFBFBF"/>
+          <w:bottom w:val="single" w:sz="4" w:space="0" w:color="BFBFBF"/>
+          <w:right w:val="single" w:sz="4" w:space="0" w:color="BFBFBF"/>
+          <w:insideH w:val="single" w:sz="4" w:space="0" w:color="BFBFBF"/>
+          <w:insideV w:val="single" w:sz="4" w:space="0" w:color="BFBFBF"/>
+        </w:tblBorders>
         <w:tblLayout w:type="fixed"/>
-        <w:tblLook w:firstColumn="1" w:firstRow="1" w:lastColumn="0" w:lastRow="0" w:noHBand="0" w:noVBand="1" w:val="04A0"/>
-        <w:tblBorders>
-          <w:top w:val="single" w:sz="4" w:color="BFBFBF"/>
-          <w:left w:val="single" w:sz="4" w:color="BFBFBF"/>
-          <w:bottom w:val="single" w:sz="4" w:color="BFBFBF"/>
-          <w:right w:val="single" w:sz="4" w:color="BFBFBF"/>
-          <w:insideH w:val="single" w:sz="4" w:color="BFBFBF"/>
-          <w:insideV w:val="single" w:sz="4" w:color="BFBFBF"/>
-        </w:tblBorders>
+        <w:tblLook w:val="04A0" w:firstRow="1" w:lastRow="0" w:firstColumn="1" w:lastColumn="0" w:noHBand="0" w:noVBand="1"/>
       </w:tblPr>
       <w:tblGrid>
         <w:gridCol w:w="1814"/>
@@ -969,18 +953,18 @@
       </w:tblGrid>
       <w:tr>
         <w:trPr>
+          <w:cantSplit/>
           <w:tblHeader/>
-          <w:cantSplit/>
         </w:trPr>
         <w:tc>
           <w:tcPr>
-            <w:tcW w:type="dxa" w:w="1814"/>
+            <w:tcW w:w="1814" w:type="dxa"/>
             <w:shd w:val="clear" w:color="auto" w:fill="1F4E79"/>
           </w:tcPr>
           <w:p>
             <w:pPr>
               <w:keepNext/>
-              <w:spacing w:after="40" w:before="40"/>
+              <w:spacing w:before="40" w:after="40"/>
             </w:pPr>
             <w:r>
               <w:rPr>
@@ -994,13 +978,13 @@
         </w:tc>
         <w:tc>
           <w:tcPr>
-            <w:tcW w:type="dxa" w:w="5499"/>
+            <w:tcW w:w="5499" w:type="dxa"/>
             <w:shd w:val="clear" w:color="auto" w:fill="1F4E79"/>
           </w:tcPr>
           <w:p>
             <w:pPr>
               <w:keepNext/>
-              <w:spacing w:after="40" w:before="40"/>
+              <w:spacing w:before="40" w:after="40"/>
             </w:pPr>
             <w:r>
               <w:rPr>
@@ -1014,13 +998,13 @@
         </w:tc>
         <w:tc>
           <w:tcPr>
-            <w:tcW w:type="dxa" w:w="1701"/>
+            <w:tcW w:w="1701" w:type="dxa"/>
             <w:shd w:val="clear" w:color="auto" w:fill="1F4E79"/>
           </w:tcPr>
           <w:p>
             <w:pPr>
               <w:keepNext/>
-              <w:spacing w:after="40" w:before="40"/>
+              <w:spacing w:before="40" w:after="40"/>
             </w:pPr>
             <w:r>
               <w:rPr>
@@ -1039,13 +1023,13 @@
         </w:trPr>
         <w:tc>
           <w:tcPr>
-            <w:tcW w:type="dxa" w:w="1814"/>
+            <w:tcW w:w="1814" w:type="dxa"/>
             <w:shd w:val="clear" w:color="auto" w:fill="EAF1F8"/>
           </w:tcPr>
           <w:p>
             <w:pPr>
               <w:keepNext/>
-              <w:spacing w:after="40" w:before="40"/>
+              <w:spacing w:before="40" w:after="40"/>
             </w:pPr>
             <w:r>
               <w:rPr>
@@ -1057,12 +1041,12 @@
         </w:tc>
         <w:tc>
           <w:tcPr>
-            <w:tcW w:type="dxa" w:w="5499"/>
-          </w:tcPr>
-          <w:p>
-            <w:pPr>
-              <w:keepNext/>
-              <w:spacing w:after="40" w:before="40"/>
+            <w:tcW w:w="5499" w:type="dxa"/>
+          </w:tcPr>
+          <w:p>
+            <w:pPr>
+              <w:keepNext/>
+              <w:spacing w:before="40" w:after="40"/>
             </w:pPr>
             <w:r>
               <w:rPr>
@@ -1074,12 +1058,12 @@
         </w:tc>
         <w:tc>
           <w:tcPr>
-            <w:tcW w:type="dxa" w:w="1701"/>
-          </w:tcPr>
-          <w:p>
-            <w:pPr>
-              <w:keepNext/>
-              <w:spacing w:after="40" w:before="40"/>
+            <w:tcW w:w="1701" w:type="dxa"/>
+          </w:tcPr>
+          <w:p>
+            <w:pPr>
+              <w:keepNext/>
+              <w:spacing w:before="40" w:after="40"/>
             </w:pPr>
             <w:r>
               <w:rPr>
@@ -1096,13 +1080,13 @@
         </w:trPr>
         <w:tc>
           <w:tcPr>
-            <w:tcW w:type="dxa" w:w="1814"/>
+            <w:tcW w:w="1814" w:type="dxa"/>
             <w:shd w:val="clear" w:color="auto" w:fill="EAF1F8"/>
           </w:tcPr>
           <w:p>
             <w:pPr>
               <w:keepNext/>
-              <w:spacing w:after="40" w:before="40"/>
+              <w:spacing w:before="40" w:after="40"/>
             </w:pPr>
             <w:r>
               <w:rPr>
@@ -1114,12 +1098,12 @@
         </w:tc>
         <w:tc>
           <w:tcPr>
-            <w:tcW w:type="dxa" w:w="5499"/>
-          </w:tcPr>
-          <w:p>
-            <w:pPr>
-              <w:keepNext/>
-              <w:spacing w:after="40" w:before="40"/>
+            <w:tcW w:w="5499" w:type="dxa"/>
+          </w:tcPr>
+          <w:p>
+            <w:pPr>
+              <w:keepNext/>
+              <w:spacing w:before="40" w:after="40"/>
             </w:pPr>
             <w:r>
               <w:rPr>
@@ -1131,12 +1115,12 @@
         </w:tc>
         <w:tc>
           <w:tcPr>
-            <w:tcW w:type="dxa" w:w="1701"/>
-          </w:tcPr>
-          <w:p>
-            <w:pPr>
-              <w:keepNext/>
-              <w:spacing w:after="40" w:before="40"/>
+            <w:tcW w:w="1701" w:type="dxa"/>
+          </w:tcPr>
+          <w:p>
+            <w:pPr>
+              <w:keepNext/>
+              <w:spacing w:before="40" w:after="40"/>
             </w:pPr>
             <w:r>
               <w:rPr>
@@ -1153,13 +1137,13 @@
         </w:trPr>
         <w:tc>
           <w:tcPr>
-            <w:tcW w:type="dxa" w:w="1814"/>
+            <w:tcW w:w="1814" w:type="dxa"/>
             <w:shd w:val="clear" w:color="auto" w:fill="EAF1F8"/>
           </w:tcPr>
           <w:p>
             <w:pPr>
               <w:keepNext/>
-              <w:spacing w:after="40" w:before="40"/>
+              <w:spacing w:before="40" w:after="40"/>
             </w:pPr>
             <w:r>
               <w:rPr>
@@ -1171,12 +1155,12 @@
         </w:tc>
         <w:tc>
           <w:tcPr>
-            <w:tcW w:type="dxa" w:w="5499"/>
-          </w:tcPr>
-          <w:p>
-            <w:pPr>
-              <w:keepNext/>
-              <w:spacing w:after="40" w:before="40"/>
+            <w:tcW w:w="5499" w:type="dxa"/>
+          </w:tcPr>
+          <w:p>
+            <w:pPr>
+              <w:keepNext/>
+              <w:spacing w:before="40" w:after="40"/>
             </w:pPr>
             <w:r>
               <w:rPr>
@@ -1188,12 +1172,12 @@
         </w:tc>
         <w:tc>
           <w:tcPr>
-            <w:tcW w:type="dxa" w:w="1701"/>
-          </w:tcPr>
-          <w:p>
-            <w:pPr>
-              <w:keepNext/>
-              <w:spacing w:after="40" w:before="40"/>
+            <w:tcW w:w="1701" w:type="dxa"/>
+          </w:tcPr>
+          <w:p>
+            <w:pPr>
+              <w:keepNext/>
+              <w:spacing w:before="40" w:after="40"/>
             </w:pPr>
             <w:r>
               <w:rPr>
@@ -1210,13 +1194,13 @@
         </w:trPr>
         <w:tc>
           <w:tcPr>
-            <w:tcW w:type="dxa" w:w="1814"/>
+            <w:tcW w:w="1814" w:type="dxa"/>
             <w:shd w:val="clear" w:color="auto" w:fill="EAF1F8"/>
           </w:tcPr>
           <w:p>
             <w:pPr>
               <w:keepNext/>
-              <w:spacing w:after="40" w:before="40"/>
+              <w:spacing w:before="40" w:after="40"/>
             </w:pPr>
             <w:r>
               <w:rPr>
@@ -1228,29 +1212,29 @@
         </w:tc>
         <w:tc>
           <w:tcPr>
-            <w:tcW w:type="dxa" w:w="5499"/>
-          </w:tcPr>
-          <w:p>
-            <w:pPr>
-              <w:keepNext/>
-              <w:spacing w:after="40" w:before="40"/>
-            </w:pPr>
-            <w:r>
-              <w:rPr>
-                <w:sz w:val="20"/>
-              </w:rPr>
-              <w:t>O corpo do trabalho. Para cada cena: minutagem, descrição do que acontece, conceito e explicação</w:t>
-            </w:r>
-          </w:p>
-        </w:tc>
-        <w:tc>
-          <w:tcPr>
-            <w:tcW w:type="dxa" w:w="1701"/>
-          </w:tcPr>
-          <w:p>
-            <w:pPr>
-              <w:keepNext/>
-              <w:spacing w:after="40" w:before="40"/>
+            <w:tcW w:w="5499" w:type="dxa"/>
+          </w:tcPr>
+          <w:p>
+            <w:pPr>
+              <w:keepNext/>
+              <w:spacing w:before="40" w:after="40"/>
+            </w:pPr>
+            <w:r>
+              <w:rPr>
+                <w:sz w:val="20"/>
+              </w:rPr>
+              <w:t>O corpo do trabalho. Para cada cena: descrição do que acontece, conceito e explicação</w:t>
+            </w:r>
+          </w:p>
+        </w:tc>
+        <w:tc>
+          <w:tcPr>
+            <w:tcW w:w="1701" w:type="dxa"/>
+          </w:tcPr>
+          <w:p>
+            <w:pPr>
+              <w:keepNext/>
+              <w:spacing w:before="40" w:after="40"/>
             </w:pPr>
             <w:r>
               <w:rPr>
@@ -1267,13 +1251,13 @@
         </w:trPr>
         <w:tc>
           <w:tcPr>
-            <w:tcW w:type="dxa" w:w="1814"/>
+            <w:tcW w:w="1814" w:type="dxa"/>
             <w:shd w:val="clear" w:color="auto" w:fill="EAF1F8"/>
           </w:tcPr>
           <w:p>
             <w:pPr>
               <w:keepNext/>
-              <w:spacing w:after="40" w:before="40"/>
+              <w:spacing w:before="40" w:after="40"/>
             </w:pPr>
             <w:r>
               <w:rPr>
@@ -1285,12 +1269,12 @@
         </w:tc>
         <w:tc>
           <w:tcPr>
-            <w:tcW w:type="dxa" w:w="5499"/>
-          </w:tcPr>
-          <w:p>
-            <w:pPr>
-              <w:keepNext/>
-              <w:spacing w:after="40" w:before="40"/>
+            <w:tcW w:w="5499" w:type="dxa"/>
+          </w:tcPr>
+          <w:p>
+            <w:pPr>
+              <w:keepNext/>
+              <w:spacing w:before="40" w:after="40"/>
             </w:pPr>
             <w:r>
               <w:rPr>
@@ -1302,12 +1286,12 @@
         </w:tc>
         <w:tc>
           <w:tcPr>
-            <w:tcW w:type="dxa" w:w="1701"/>
-          </w:tcPr>
-          <w:p>
-            <w:pPr>
-              <w:keepNext/>
-              <w:spacing w:after="40" w:before="40"/>
+            <w:tcW w:w="1701" w:type="dxa"/>
+          </w:tcPr>
+          <w:p>
+            <w:pPr>
+              <w:keepNext/>
+              <w:spacing w:before="40" w:after="40"/>
             </w:pPr>
             <w:r>
               <w:rPr>
@@ -1324,13 +1308,13 @@
         </w:trPr>
         <w:tc>
           <w:tcPr>
-            <w:tcW w:type="dxa" w:w="1814"/>
+            <w:tcW w:w="1814" w:type="dxa"/>
             <w:shd w:val="clear" w:color="auto" w:fill="EAF1F8"/>
           </w:tcPr>
           <w:p>
             <w:pPr>
               <w:keepNext/>
-              <w:spacing w:after="40" w:before="40"/>
+              <w:spacing w:before="40" w:after="40"/>
             </w:pPr>
             <w:r>
               <w:rPr>
@@ -1342,12 +1326,12 @@
         </w:tc>
         <w:tc>
           <w:tcPr>
-            <w:tcW w:type="dxa" w:w="5499"/>
-          </w:tcPr>
-          <w:p>
-            <w:pPr>
-              <w:keepNext/>
-              <w:spacing w:after="40" w:before="40"/>
+            <w:tcW w:w="5499" w:type="dxa"/>
+          </w:tcPr>
+          <w:p>
+            <w:pPr>
+              <w:keepNext/>
+              <w:spacing w:before="40" w:after="40"/>
             </w:pPr>
             <w:r>
               <w:rPr>
@@ -1359,12 +1343,12 @@
         </w:tc>
         <w:tc>
           <w:tcPr>
-            <w:tcW w:type="dxa" w:w="1701"/>
-          </w:tcPr>
-          <w:p>
-            <w:pPr>
-              <w:keepNext/>
-              <w:spacing w:after="40" w:before="40"/>
+            <w:tcW w:w="1701" w:type="dxa"/>
+          </w:tcPr>
+          <w:p>
+            <w:pPr>
+              <w:keepNext/>
+              <w:spacing w:before="40" w:after="40"/>
             </w:pPr>
             <w:r>
               <w:rPr>
@@ -1381,13 +1365,12 @@
         </w:trPr>
         <w:tc>
           <w:tcPr>
-            <w:tcW w:type="dxa" w:w="1814"/>
+            <w:tcW w:w="1814" w:type="dxa"/>
             <w:shd w:val="clear" w:color="auto" w:fill="EAF1F8"/>
           </w:tcPr>
           <w:p>
             <w:pPr>
-              <w:keepNext w:val="0"/>
-              <w:spacing w:after="40" w:before="40"/>
+              <w:spacing w:before="40" w:after="40"/>
             </w:pPr>
             <w:r>
               <w:rPr>
@@ -1399,12 +1382,11 @@
         </w:tc>
         <w:tc>
           <w:tcPr>
-            <w:tcW w:type="dxa" w:w="5499"/>
-          </w:tcPr>
-          <w:p>
-            <w:pPr>
-              <w:keepNext w:val="0"/>
-              <w:spacing w:after="40" w:before="40"/>
+            <w:tcW w:w="5499" w:type="dxa"/>
+          </w:tcPr>
+          <w:p>
+            <w:pPr>
+              <w:spacing w:before="40" w:after="40"/>
             </w:pPr>
             <w:r>
               <w:rPr>
@@ -1416,12 +1398,11 @@
         </w:tc>
         <w:tc>
           <w:tcPr>
-            <w:tcW w:type="dxa" w:w="1701"/>
-          </w:tcPr>
-          <w:p>
-            <w:pPr>
-              <w:keepNext w:val="0"/>
-              <w:spacing w:after="40" w:before="40"/>
+            <w:tcW w:w="1701" w:type="dxa"/>
+          </w:tcPr>
+          <w:p>
+            <w:pPr>
+              <w:spacing w:before="40" w:after="40"/>
             </w:pPr>
             <w:r>
               <w:rPr>
@@ -1433,25 +1414,22 @@
         </w:tc>
       </w:tr>
     </w:tbl>
-    <w:p>
-      <w:pPr>
-        <w:spacing w:after="0"/>
-      </w:pPr>
-    </w:p>
+    <w:p/>
     <w:p>
       <w:pPr>
         <w:pStyle w:val="Ttulo2"/>
       </w:pPr>
       <w:r>
+        <w:lastRenderedPageBreak/>
         <w:t>Como escrever cada cena da análise</w:t>
       </w:r>
     </w:p>
     <w:p>
       <w:pPr>
         <w:tabs>
-          <w:tab w:pos="567" w:val="left"/>
+          <w:tab w:val="left" w:pos="567"/>
         </w:tabs>
-        <w:spacing w:before="0" w:after="80" w:line="300" w:lineRule="auto"/>
+        <w:spacing w:after="80" w:line="300" w:lineRule="auto"/>
         <w:ind w:left="567" w:hanging="567"/>
         <w:jc w:val="both"/>
       </w:pPr>
@@ -1477,9 +1455,9 @@
     <w:p>
       <w:pPr>
         <w:tabs>
-          <w:tab w:pos="567" w:val="left"/>
+          <w:tab w:val="left" w:pos="567"/>
         </w:tabs>
-        <w:spacing w:before="0" w:after="80" w:line="300" w:lineRule="auto"/>
+        <w:spacing w:after="80" w:line="300" w:lineRule="auto"/>
         <w:ind w:left="567" w:hanging="567"/>
         <w:jc w:val="both"/>
       </w:pPr>
@@ -1505,9 +1483,9 @@
     <w:p>
       <w:pPr>
         <w:tabs>
-          <w:tab w:pos="567" w:val="left"/>
+          <w:tab w:val="left" w:pos="567"/>
         </w:tabs>
-        <w:spacing w:before="0" w:after="80" w:line="300" w:lineRule="auto"/>
+        <w:spacing w:after="80" w:line="300" w:lineRule="auto"/>
         <w:ind w:left="567" w:hanging="567"/>
         <w:jc w:val="both"/>
       </w:pPr>
@@ -1533,9 +1511,9 @@
     <w:p>
       <w:pPr>
         <w:tabs>
-          <w:tab w:pos="567" w:val="left"/>
+          <w:tab w:val="left" w:pos="567"/>
         </w:tabs>
-        <w:spacing w:before="0" w:after="80" w:line="300" w:lineRule="auto"/>
+        <w:spacing w:after="80" w:line="300" w:lineRule="auto"/>
         <w:ind w:left="567" w:hanging="567"/>
         <w:jc w:val="both"/>
       </w:pPr>
@@ -1556,199 +1534,6 @@
       </w:r>
       <w:r>
         <w:t xml:space="preserve"> a cena com o conceito: o que é estímulo, o que é resposta, o que é consequência, e o que isso prevê para o comportamento seguinte.</w:t>
-      </w:r>
-    </w:p>
-    <w:p>
-      <w:pPr>
-        <w:pStyle w:val="Ttulo1"/>
-      </w:pPr>
-      <w:r>
-        <w:t>5. Como fazer</w:t>
-      </w:r>
-    </w:p>
-    <w:p>
-      <w:pPr>
-        <w:tabs>
-          <w:tab w:pos="567" w:val="left"/>
-        </w:tabs>
-        <w:spacing w:before="0" w:after="80" w:line="300" w:lineRule="auto"/>
-        <w:ind w:left="567" w:hanging="567"/>
-        <w:jc w:val="both"/>
-      </w:pPr>
-      <w:r>
-        <w:rPr>
-          <w:b/>
-        </w:rPr>
-        <w:t>1.</w:t>
-      </w:r>
-      <w:r>
-        <w:tab/>
-      </w:r>
-      <w:r>
-        <w:t>Assistam ao filme inteiro uma vez, sem anotar.</w:t>
-      </w:r>
-    </w:p>
-    <w:p>
-      <w:pPr>
-        <w:tabs>
-          <w:tab w:pos="567" w:val="left"/>
-        </w:tabs>
-        <w:spacing w:before="0" w:after="80" w:line="300" w:lineRule="auto"/>
-        <w:ind w:left="567" w:hanging="567"/>
-        <w:jc w:val="both"/>
-      </w:pPr>
-      <w:r>
-        <w:rPr>
-          <w:b/>
-        </w:rPr>
-        <w:t>2.</w:t>
-      </w:r>
-      <w:r>
-        <w:tab/>
-      </w:r>
-      <w:r>
-        <w:t>Assistam de novo anotando as cenas que interessam, com a minutagem.</w:t>
-      </w:r>
-    </w:p>
-    <w:p>
-      <w:pPr>
-        <w:tabs>
-          <w:tab w:pos="567" w:val="left"/>
-        </w:tabs>
-        <w:spacing w:before="0" w:after="80" w:line="300" w:lineRule="auto"/>
-        <w:ind w:left="567" w:hanging="567"/>
-        <w:jc w:val="both"/>
-      </w:pPr>
-      <w:r>
-        <w:rPr>
-          <w:b/>
-        </w:rPr>
-        <w:t>3.</w:t>
-      </w:r>
-      <w:r>
-        <w:tab/>
-      </w:r>
-      <w:r>
-        <w:t>Escolham de 3 a 5 cenas e, para cada uma, montem a contingência antes de escrever.</w:t>
-      </w:r>
-    </w:p>
-    <w:p>
-      <w:pPr>
-        <w:tabs>
-          <w:tab w:pos="567" w:val="left"/>
-        </w:tabs>
-        <w:spacing w:before="0" w:after="80" w:line="300" w:lineRule="auto"/>
-        <w:ind w:left="567" w:hanging="567"/>
-        <w:jc w:val="both"/>
-      </w:pPr>
-      <w:r>
-        <w:rPr>
-          <w:b/>
-        </w:rPr>
-        <w:t>4.</w:t>
-      </w:r>
-      <w:r>
-        <w:tab/>
-      </w:r>
-      <w:r>
-        <w:t>Releiam no livro os capítulos dos conceitos escolhidos.</w:t>
-      </w:r>
-    </w:p>
-    <w:p>
-      <w:pPr>
-        <w:tabs>
-          <w:tab w:pos="567" w:val="left"/>
-        </w:tabs>
-        <w:spacing w:before="0" w:after="80" w:line="300" w:lineRule="auto"/>
-        <w:ind w:left="567" w:hanging="567"/>
-        <w:jc w:val="both"/>
-      </w:pPr>
-      <w:r>
-        <w:rPr>
-          <w:b/>
-        </w:rPr>
-        <w:t>5.</w:t>
-      </w:r>
-      <w:r>
-        <w:tab/>
-      </w:r>
-      <w:r>
-        <w:t>Escrevam a análise primeiro; a introdução e a conclusão, por último.</w:t>
-      </w:r>
-    </w:p>
-    <w:p>
-      <w:pPr>
-        <w:tabs>
-          <w:tab w:pos="567" w:val="left"/>
-        </w:tabs>
-        <w:spacing w:before="0" w:after="80" w:line="300" w:lineRule="auto"/>
-        <w:ind w:left="567" w:hanging="567"/>
-        <w:jc w:val="both"/>
-      </w:pPr>
-      <w:r>
-        <w:rPr>
-          <w:b/>
-        </w:rPr>
-        <w:t>6.</w:t>
-      </w:r>
-      <w:r>
-        <w:tab/>
-      </w:r>
-      <w:r>
-        <w:t>Revisem juntos: cada conceito está definido? Cada cena está explicada, e não só descrita?</w:t>
-      </w:r>
-    </w:p>
-    <w:p>
-      <w:pPr>
-        <w:pStyle w:val="Ttulo2"/>
-      </w:pPr>
-      <w:r>
-        <w:t>Citação e referências (ABNT)</w:t>
-      </w:r>
-    </w:p>
-    <w:p>
-      <w:pPr>
-        <w:spacing w:before="0" w:after="120" w:line="300" w:lineRule="auto"/>
-        <w:jc w:val="both"/>
-      </w:pPr>
-      <w:r>
-        <w:t>Toda definição de conceito vem com a citação do livro, por exemplo: (MOREIRA; MEDEIROS, 2007, p. 50). Modelos de referência:</w:t>
-      </w:r>
-    </w:p>
-    <w:p>
-      <w:pPr>
-        <w:spacing w:before="0" w:after="80" w:line="300" w:lineRule="auto"/>
-        <w:ind w:left="567"/>
-      </w:pPr>
-      <w:r>
-        <w:t xml:space="preserve">MOREIRA, M. B.; MEDEIROS, C. A. </w:t>
-      </w:r>
-      <w:r>
-        <w:rPr>
-          <w:b/>
-        </w:rPr>
-        <w:t>Princípios básicos de análise do comportamento</w:t>
-      </w:r>
-      <w:r>
-        <w:t>. Porto Alegre: Artmed, 2007.</w:t>
-      </w:r>
-    </w:p>
-    <w:p>
-      <w:pPr>
-        <w:spacing w:before="0" w:after="80" w:line="300" w:lineRule="auto"/>
-        <w:ind w:left="567"/>
-      </w:pPr>
-      <w:r>
-        <w:t>LARANJA mecânica. Direção: Stanley Kubrick. Reino Unido; Estados Unidos: Warner Bros., 1971. 1 filme (136 min).</w:t>
-      </w:r>
-    </w:p>
-    <w:p>
-      <w:pPr>
-        <w:spacing w:before="0" w:after="80" w:line="300" w:lineRule="auto"/>
-        <w:ind w:left="567"/>
-      </w:pPr>
-      <w:r>
-        <w:t>O SHOW de Truman: o show da vida. Direção: Peter Weir. Estados Unidos: Paramount Pictures, 1998. 1 filme (103 min).</w:t>
       </w:r>
     </w:p>
     <w:p>
@@ -1766,7 +1551,7 @@
           <w:ilvl w:val="0"/>
           <w:numId w:val="1"/>
         </w:numPr>
-        <w:spacing w:before="0" w:after="60" w:line="300" w:lineRule="auto"/>
+        <w:spacing w:after="60" w:line="300" w:lineRule="auto"/>
         <w:jc w:val="both"/>
       </w:pPr>
       <w:r>
@@ -1780,7 +1565,7 @@
           <w:ilvl w:val="0"/>
           <w:numId w:val="1"/>
         </w:numPr>
-        <w:spacing w:before="0" w:after="60" w:line="300" w:lineRule="auto"/>
+        <w:spacing w:after="60" w:line="300" w:lineRule="auto"/>
         <w:jc w:val="both"/>
       </w:pPr>
       <w:r>
@@ -1794,7 +1579,7 @@
           <w:ilvl w:val="0"/>
           <w:numId w:val="1"/>
         </w:numPr>
-        <w:spacing w:before="0" w:after="60" w:line="300" w:lineRule="auto"/>
+        <w:spacing w:after="60" w:line="300" w:lineRule="auto"/>
         <w:jc w:val="both"/>
       </w:pPr>
       <w:r>
@@ -1806,22 +1591,25 @@
         <w:pStyle w:val="Ttulo1"/>
       </w:pPr>
       <w:r>
-        <w:t>6. Formatação e entrega</w:t>
+        <w:t>5</w:t>
+      </w:r>
+      <w:r>
+        <w:t>. Formatação e entrega</w:t>
       </w:r>
     </w:p>
     <w:tbl>
       <w:tblPr>
-        <w:tblW w:type="auto" w:w="0"/>
+        <w:tblW w:w="0" w:type="auto"/>
+        <w:tblBorders>
+          <w:top w:val="single" w:sz="4" w:space="0" w:color="BFBFBF"/>
+          <w:left w:val="single" w:sz="4" w:space="0" w:color="BFBFBF"/>
+          <w:bottom w:val="single" w:sz="4" w:space="0" w:color="BFBFBF"/>
+          <w:right w:val="single" w:sz="4" w:space="0" w:color="BFBFBF"/>
+          <w:insideH w:val="single" w:sz="4" w:space="0" w:color="BFBFBF"/>
+          <w:insideV w:val="single" w:sz="4" w:space="0" w:color="BFBFBF"/>
+        </w:tblBorders>
         <w:tblLayout w:type="fixed"/>
-        <w:tblLook w:firstColumn="1" w:firstRow="1" w:lastColumn="0" w:lastRow="0" w:noHBand="0" w:noVBand="1" w:val="04A0"/>
-        <w:tblBorders>
-          <w:top w:val="single" w:sz="4" w:color="BFBFBF"/>
-          <w:left w:val="single" w:sz="4" w:color="BFBFBF"/>
-          <w:bottom w:val="single" w:sz="4" w:color="BFBFBF"/>
-          <w:right w:val="single" w:sz="4" w:color="BFBFBF"/>
-          <w:insideH w:val="single" w:sz="4" w:color="BFBFBF"/>
-          <w:insideV w:val="single" w:sz="4" w:color="BFBFBF"/>
-        </w:tblBorders>
+        <w:tblLook w:val="04A0" w:firstRow="1" w:lastRow="0" w:firstColumn="1" w:lastColumn="0" w:noHBand="0" w:noVBand="1"/>
       </w:tblPr>
       <w:tblGrid>
         <w:gridCol w:w="1984"/>
@@ -1829,18 +1617,18 @@
       </w:tblGrid>
       <w:tr>
         <w:trPr>
+          <w:cantSplit/>
           <w:tblHeader/>
-          <w:cantSplit/>
         </w:trPr>
         <w:tc>
           <w:tcPr>
-            <w:tcW w:type="dxa" w:w="1984"/>
+            <w:tcW w:w="1984" w:type="dxa"/>
             <w:shd w:val="clear" w:color="auto" w:fill="1F4E79"/>
           </w:tcPr>
           <w:p>
             <w:pPr>
               <w:keepNext/>
-              <w:spacing w:after="40" w:before="40"/>
+              <w:spacing w:before="40" w:after="40"/>
             </w:pPr>
             <w:r>
               <w:rPr>
@@ -1854,13 +1642,13 @@
         </w:tc>
         <w:tc>
           <w:tcPr>
-            <w:tcW w:type="dxa" w:w="7030"/>
+            <w:tcW w:w="7030" w:type="dxa"/>
             <w:shd w:val="clear" w:color="auto" w:fill="1F4E79"/>
           </w:tcPr>
           <w:p>
             <w:pPr>
               <w:keepNext/>
-              <w:spacing w:after="40" w:before="40"/>
+              <w:spacing w:before="40" w:after="40"/>
             </w:pPr>
             <w:r>
               <w:rPr>
@@ -1879,13 +1667,13 @@
         </w:trPr>
         <w:tc>
           <w:tcPr>
-            <w:tcW w:type="dxa" w:w="1984"/>
+            <w:tcW w:w="1984" w:type="dxa"/>
             <w:shd w:val="clear" w:color="auto" w:fill="EAF1F8"/>
           </w:tcPr>
           <w:p>
             <w:pPr>
               <w:keepNext/>
-              <w:spacing w:after="40" w:before="40"/>
+              <w:spacing w:before="40" w:after="40"/>
             </w:pPr>
             <w:r>
               <w:rPr>
@@ -1897,12 +1685,12 @@
         </w:tc>
         <w:tc>
           <w:tcPr>
-            <w:tcW w:type="dxa" w:w="7030"/>
-          </w:tcPr>
-          <w:p>
-            <w:pPr>
-              <w:keepNext/>
-              <w:spacing w:after="40" w:before="40"/>
+            <w:tcW w:w="7030" w:type="dxa"/>
+          </w:tcPr>
+          <w:p>
+            <w:pPr>
+              <w:keepNext/>
+              <w:spacing w:before="40" w:after="40"/>
             </w:pPr>
             <w:r>
               <w:rPr>
@@ -1919,13 +1707,13 @@
         </w:trPr>
         <w:tc>
           <w:tcPr>
-            <w:tcW w:type="dxa" w:w="1984"/>
+            <w:tcW w:w="1984" w:type="dxa"/>
             <w:shd w:val="clear" w:color="auto" w:fill="EAF1F8"/>
           </w:tcPr>
           <w:p>
             <w:pPr>
               <w:keepNext/>
-              <w:spacing w:after="40" w:before="40"/>
+              <w:spacing w:before="40" w:after="40"/>
             </w:pPr>
             <w:r>
               <w:rPr>
@@ -1937,12 +1725,12 @@
         </w:tc>
         <w:tc>
           <w:tcPr>
-            <w:tcW w:type="dxa" w:w="7030"/>
-          </w:tcPr>
-          <w:p>
-            <w:pPr>
-              <w:keepNext/>
-              <w:spacing w:after="40" w:before="40"/>
+            <w:tcW w:w="7030" w:type="dxa"/>
+          </w:tcPr>
+          <w:p>
+            <w:pPr>
+              <w:keepNext/>
+              <w:spacing w:before="40" w:after="40"/>
             </w:pPr>
             <w:r>
               <w:rPr>
@@ -1959,13 +1747,13 @@
         </w:trPr>
         <w:tc>
           <w:tcPr>
-            <w:tcW w:type="dxa" w:w="1984"/>
+            <w:tcW w:w="1984" w:type="dxa"/>
             <w:shd w:val="clear" w:color="auto" w:fill="EAF1F8"/>
           </w:tcPr>
           <w:p>
             <w:pPr>
               <w:keepNext/>
-              <w:spacing w:after="40" w:before="40"/>
+              <w:spacing w:before="40" w:after="40"/>
             </w:pPr>
             <w:r>
               <w:rPr>
@@ -1977,12 +1765,12 @@
         </w:tc>
         <w:tc>
           <w:tcPr>
-            <w:tcW w:type="dxa" w:w="7030"/>
-          </w:tcPr>
-          <w:p>
-            <w:pPr>
-              <w:keepNext/>
-              <w:spacing w:after="40" w:before="40"/>
+            <w:tcW w:w="7030" w:type="dxa"/>
+          </w:tcPr>
+          <w:p>
+            <w:pPr>
+              <w:keepNext/>
+              <w:spacing w:before="40" w:after="40"/>
             </w:pPr>
             <w:r>
               <w:rPr>
@@ -1999,13 +1787,13 @@
         </w:trPr>
         <w:tc>
           <w:tcPr>
-            <w:tcW w:type="dxa" w:w="1984"/>
+            <w:tcW w:w="1984" w:type="dxa"/>
             <w:shd w:val="clear" w:color="auto" w:fill="EAF1F8"/>
           </w:tcPr>
           <w:p>
             <w:pPr>
               <w:keepNext/>
-              <w:spacing w:after="40" w:before="40"/>
+              <w:spacing w:before="40" w:after="40"/>
             </w:pPr>
             <w:r>
               <w:rPr>
@@ -2017,18 +1805,24 @@
         </w:tc>
         <w:tc>
           <w:tcPr>
-            <w:tcW w:type="dxa" w:w="7030"/>
-          </w:tcPr>
-          <w:p>
-            <w:pPr>
-              <w:keepNext/>
-              <w:spacing w:after="40" w:before="40"/>
-            </w:pPr>
-            <w:r>
-              <w:rPr>
-                <w:sz w:val="20"/>
-              </w:rPr>
-              <w:t>5 a 8 páginas, sem contar capa e referências</w:t>
+            <w:tcW w:w="7030" w:type="dxa"/>
+          </w:tcPr>
+          <w:p>
+            <w:pPr>
+              <w:keepNext/>
+              <w:spacing w:before="40" w:after="40"/>
+            </w:pPr>
+            <w:r>
+              <w:rPr>
+                <w:sz w:val="20"/>
+              </w:rPr>
+              <w:t>5 a 8 páginas</w:t>
+            </w:r>
+            <w:r>
+              <w:rPr>
+                <w:sz w:val="20"/>
+              </w:rPr>
+              <w:t>.</w:t>
             </w:r>
           </w:p>
         </w:tc>
@@ -2039,13 +1833,13 @@
         </w:trPr>
         <w:tc>
           <w:tcPr>
-            <w:tcW w:type="dxa" w:w="1984"/>
+            <w:tcW w:w="1984" w:type="dxa"/>
             <w:shd w:val="clear" w:color="auto" w:fill="EAF1F8"/>
           </w:tcPr>
           <w:p>
             <w:pPr>
               <w:keepNext/>
-              <w:spacing w:after="40" w:before="40"/>
+              <w:spacing w:before="40" w:after="40"/>
             </w:pPr>
             <w:r>
               <w:rPr>
@@ -2057,12 +1851,12 @@
         </w:tc>
         <w:tc>
           <w:tcPr>
-            <w:tcW w:type="dxa" w:w="7030"/>
-          </w:tcPr>
-          <w:p>
-            <w:pPr>
-              <w:keepNext/>
-              <w:spacing w:after="40" w:before="40"/>
+            <w:tcW w:w="7030" w:type="dxa"/>
+          </w:tcPr>
+          <w:p>
+            <w:pPr>
+              <w:keepNext/>
+              <w:spacing w:before="40" w:after="40"/>
             </w:pPr>
             <w:r>
               <w:rPr>
@@ -2075,7 +1869,7 @@
                 <w:b/>
                 <w:sz w:val="20"/>
               </w:rPr>
-              <w:t>filme-sobrenomes.pdf</w:t>
+              <w:t>filme-nomes.pdf</w:t>
             </w:r>
             <w:r>
               <w:rPr>
@@ -2092,13 +1886,13 @@
         </w:trPr>
         <w:tc>
           <w:tcPr>
-            <w:tcW w:type="dxa" w:w="1984"/>
+            <w:tcW w:w="1984" w:type="dxa"/>
             <w:shd w:val="clear" w:color="auto" w:fill="EAF1F8"/>
           </w:tcPr>
           <w:p>
             <w:pPr>
               <w:keepNext/>
-              <w:spacing w:after="40" w:before="40"/>
+              <w:spacing w:before="40" w:after="40"/>
             </w:pPr>
             <w:r>
               <w:rPr>
@@ -2110,18 +1904,48 @@
         </w:tc>
         <w:tc>
           <w:tcPr>
-            <w:tcW w:type="dxa" w:w="7030"/>
-          </w:tcPr>
-          <w:p>
-            <w:pPr>
-              <w:keepNext/>
-              <w:spacing w:after="40" w:before="40"/>
-            </w:pPr>
-            <w:r>
-              <w:rPr>
-                <w:sz w:val="20"/>
-              </w:rPr>
-              <w:t>Por um integrante do grupo, em: ______________________________</w:t>
+            <w:tcW w:w="7030" w:type="dxa"/>
+          </w:tcPr>
+          <w:p>
+            <w:pPr>
+              <w:keepNext/>
+              <w:spacing w:before="40" w:after="40"/>
+            </w:pPr>
+            <w:r>
+              <w:rPr>
+                <w:sz w:val="20"/>
+              </w:rPr>
+              <w:t>Por</w:t>
+            </w:r>
+            <w:r>
+              <w:rPr>
+                <w:sz w:val="20"/>
+              </w:rPr>
+              <w:t xml:space="preserve"> todos os</w:t>
+            </w:r>
+            <w:r>
+              <w:rPr>
+                <w:sz w:val="20"/>
+              </w:rPr>
+              <w:t xml:space="preserve"> integrante</w:t>
+            </w:r>
+            <w:r>
+              <w:rPr>
+                <w:sz w:val="20"/>
+              </w:rPr>
+              <w:t>s</w:t>
+            </w:r>
+            <w:r>
+              <w:rPr>
+                <w:sz w:val="20"/>
+              </w:rPr>
+              <w:t xml:space="preserve"> do grupo, em: </w:t>
+            </w:r>
+            <w:r>
+              <w:rPr>
+                <w:sz w:val="20"/>
+              </w:rPr>
+              <w:t>25/11/2026</w:t>
             </w:r>
           </w:p>
         </w:tc>
@@ -2132,13 +1956,13 @@
         </w:trPr>
         <w:tc>
           <w:tcPr>
-            <w:tcW w:type="dxa" w:w="1984"/>
+            <w:tcW w:w="1984" w:type="dxa"/>
             <w:shd w:val="clear" w:color="auto" w:fill="EAF1F8"/>
           </w:tcPr>
           <w:p>
             <w:pPr>
               <w:keepNext/>
-              <w:spacing w:after="40" w:before="40"/>
+              <w:spacing w:before="40" w:after="40"/>
             </w:pPr>
             <w:r>
               <w:rPr>
@@ -2150,12 +1974,12 @@
         </w:tc>
         <w:tc>
           <w:tcPr>
-            <w:tcW w:type="dxa" w:w="7030"/>
-          </w:tcPr>
-          <w:p>
-            <w:pPr>
-              <w:keepNext/>
-              <w:spacing w:after="40" w:before="40"/>
+            <w:tcW w:w="7030" w:type="dxa"/>
+          </w:tcPr>
+          <w:p>
+            <w:pPr>
+              <w:keepNext/>
+              <w:spacing w:before="40" w:after="40"/>
             </w:pPr>
             <w:r>
               <w:rPr>
@@ -2168,7 +1992,19 @@
               <w:rPr>
                 <w:sz w:val="20"/>
               </w:rPr>
-              <w:t>, até ______ h</w:t>
+              <w:t xml:space="preserve">, até </w:t>
+            </w:r>
+            <w:r>
+              <w:rPr>
+                <w:sz w:val="20"/>
+              </w:rPr>
+              <w:t>23:59</w:t>
+            </w:r>
+            <w:r>
+              <w:rPr>
+                <w:sz w:val="20"/>
+              </w:rPr>
+              <w:t xml:space="preserve"> h</w:t>
             </w:r>
           </w:p>
         </w:tc>
@@ -2179,13 +2015,12 @@
         </w:trPr>
         <w:tc>
           <w:tcPr>
-            <w:tcW w:type="dxa" w:w="1984"/>
+            <w:tcW w:w="1984" w:type="dxa"/>
             <w:shd w:val="clear" w:color="auto" w:fill="EAF1F8"/>
           </w:tcPr>
           <w:p>
             <w:pPr>
-              <w:keepNext w:val="0"/>
-              <w:spacing w:after="40" w:before="40"/>
+              <w:spacing w:before="40" w:after="40"/>
             </w:pPr>
             <w:r>
               <w:rPr>
@@ -2197,29 +2032,43 @@
         </w:tc>
         <w:tc>
           <w:tcPr>
-            <w:tcW w:type="dxa" w:w="7030"/>
-          </w:tcPr>
-          <w:p>
-            <w:pPr>
-              <w:keepNext w:val="0"/>
-              <w:spacing w:after="40" w:before="40"/>
-            </w:pPr>
-            <w:r>
-              <w:rPr>
-                <w:i/>
-                <w:sz w:val="20"/>
-              </w:rPr>
-              <w:t>____________________________</w:t>
+            <w:tcW w:w="7030" w:type="dxa"/>
+          </w:tcPr>
+          <w:p>
+            <w:pPr>
+              <w:spacing w:before="40" w:after="40"/>
+              <w:rPr>
+                <w:iCs/>
+              </w:rPr>
+            </w:pPr>
+            <w:r>
+              <w:rPr>
+                <w:iCs/>
+                <w:sz w:val="20"/>
+              </w:rPr>
+              <w:t xml:space="preserve">Trabalhos entregues com atraso serão </w:t>
+            </w:r>
+            <w:proofErr w:type="gramStart"/>
+            <w:r>
+              <w:rPr>
+                <w:iCs/>
+                <w:sz w:val="20"/>
+              </w:rPr>
+              <w:t>descontado</w:t>
+            </w:r>
+            <w:proofErr w:type="gramEnd"/>
+            <w:r>
+              <w:rPr>
+                <w:iCs/>
+                <w:sz w:val="20"/>
+              </w:rPr>
+              <w:t xml:space="preserve"> 0,5 pontos por dia de atraso.</w:t>
             </w:r>
           </w:p>
         </w:tc>
       </w:tr>
     </w:tbl>
-    <w:p>
-      <w:pPr>
-        <w:spacing w:after="0"/>
-      </w:pPr>
-    </w:p>
+    <w:p/>
     <w:p>
       <w:pPr>
         <w:pStyle w:val="Ttulo1"/>
@@ -2230,7 +2079,7 @@
     </w:p>
     <w:p>
       <w:pPr>
-        <w:spacing w:before="0" w:after="120" w:line="300" w:lineRule="auto"/>
+        <w:spacing w:after="120" w:line="300" w:lineRule="auto"/>
         <w:jc w:val="both"/>
       </w:pPr>
       <w:r>
@@ -2248,17 +2097,17 @@
     </w:p>
     <w:tbl>
       <w:tblPr>
-        <w:tblW w:type="auto" w:w="0"/>
+        <w:tblW w:w="0" w:type="auto"/>
+        <w:tblBorders>
+          <w:top w:val="single" w:sz="4" w:space="0" w:color="BFBFBF"/>
+          <w:left w:val="single" w:sz="4" w:space="0" w:color="BFBFBF"/>
+          <w:bottom w:val="single" w:sz="4" w:space="0" w:color="BFBFBF"/>
+          <w:right w:val="single" w:sz="4" w:space="0" w:color="BFBFBF"/>
+          <w:insideH w:val="single" w:sz="4" w:space="0" w:color="BFBFBF"/>
+          <w:insideV w:val="single" w:sz="4" w:space="0" w:color="BFBFBF"/>
+        </w:tblBorders>
         <w:tblLayout w:type="fixed"/>
-        <w:tblLook w:firstColumn="1" w:firstRow="1" w:lastColumn="0" w:lastRow="0" w:noHBand="0" w:noVBand="1" w:val="04A0"/>
-        <w:tblBorders>
-          <w:top w:val="single" w:sz="4" w:color="BFBFBF"/>
-          <w:left w:val="single" w:sz="4" w:color="BFBFBF"/>
-          <w:bottom w:val="single" w:sz="4" w:color="BFBFBF"/>
-          <w:right w:val="single" w:sz="4" w:color="BFBFBF"/>
-          <w:insideH w:val="single" w:sz="4" w:color="BFBFBF"/>
-          <w:insideV w:val="single" w:sz="4" w:color="BFBFBF"/>
-        </w:tblBorders>
+        <w:tblLook w:val="04A0" w:firstRow="1" w:lastRow="0" w:firstColumn="1" w:lastColumn="0" w:noHBand="0" w:noVBand="1"/>
       </w:tblPr>
       <w:tblGrid>
         <w:gridCol w:w="2098"/>
@@ -2268,18 +2117,18 @@
       </w:tblGrid>
       <w:tr>
         <w:trPr>
+          <w:cantSplit/>
           <w:tblHeader/>
-          <w:cantSplit/>
         </w:trPr>
         <w:tc>
           <w:tcPr>
-            <w:tcW w:type="dxa" w:w="2098"/>
+            <w:tcW w:w="2098" w:type="dxa"/>
             <w:shd w:val="clear" w:color="auto" w:fill="1F4E79"/>
           </w:tcPr>
           <w:p>
             <w:pPr>
               <w:keepNext/>
-              <w:spacing w:after="40" w:before="40"/>
+              <w:spacing w:before="40" w:after="40"/>
             </w:pPr>
             <w:r>
               <w:rPr>
@@ -2287,19 +2136,20 @@
                 <w:color w:val="FFFFFF"/>
                 <w:sz w:val="19"/>
               </w:rPr>
+              <w:lastRenderedPageBreak/>
               <w:t>Critério</w:t>
             </w:r>
           </w:p>
         </w:tc>
         <w:tc>
           <w:tcPr>
-            <w:tcW w:type="dxa" w:w="2381"/>
+            <w:tcW w:w="2381" w:type="dxa"/>
             <w:shd w:val="clear" w:color="auto" w:fill="1F4E79"/>
           </w:tcPr>
           <w:p>
             <w:pPr>
               <w:keepNext/>
-              <w:spacing w:after="40" w:before="40"/>
+              <w:spacing w:before="40" w:after="40"/>
             </w:pPr>
             <w:r>
               <w:rPr>
@@ -2313,13 +2163,13 @@
         </w:tc>
         <w:tc>
           <w:tcPr>
-            <w:tcW w:type="dxa" w:w="2268"/>
+            <w:tcW w:w="2268" w:type="dxa"/>
             <w:shd w:val="clear" w:color="auto" w:fill="1F4E79"/>
           </w:tcPr>
           <w:p>
             <w:pPr>
               <w:keepNext/>
-              <w:spacing w:after="40" w:before="40"/>
+              <w:spacing w:before="40" w:after="40"/>
             </w:pPr>
             <w:r>
               <w:rPr>
@@ -2333,13 +2183,13 @@
         </w:tc>
         <w:tc>
           <w:tcPr>
-            <w:tcW w:type="dxa" w:w="2268"/>
+            <w:tcW w:w="2268" w:type="dxa"/>
             <w:shd w:val="clear" w:color="auto" w:fill="1F4E79"/>
           </w:tcPr>
           <w:p>
             <w:pPr>
               <w:keepNext/>
-              <w:spacing w:after="40" w:before="40"/>
+              <w:spacing w:before="40" w:after="40"/>
             </w:pPr>
             <w:r>
               <w:rPr>
@@ -2358,13 +2208,13 @@
         </w:trPr>
         <w:tc>
           <w:tcPr>
-            <w:tcW w:type="dxa" w:w="2098"/>
+            <w:tcW w:w="2098" w:type="dxa"/>
             <w:shd w:val="clear" w:color="auto" w:fill="EAF1F8"/>
           </w:tcPr>
           <w:p>
             <w:pPr>
               <w:keepNext/>
-              <w:spacing w:after="40" w:before="40"/>
+              <w:spacing w:before="40" w:after="40"/>
             </w:pPr>
             <w:r>
               <w:rPr>
@@ -2383,12 +2233,12 @@
         </w:tc>
         <w:tc>
           <w:tcPr>
-            <w:tcW w:type="dxa" w:w="2381"/>
-          </w:tcPr>
-          <w:p>
-            <w:pPr>
-              <w:keepNext/>
-              <w:spacing w:after="40" w:before="40"/>
+            <w:tcW w:w="2381" w:type="dxa"/>
+          </w:tcPr>
+          <w:p>
+            <w:pPr>
+              <w:keepNext/>
+              <w:spacing w:before="40" w:after="40"/>
             </w:pPr>
             <w:r>
               <w:rPr>
@@ -2400,12 +2250,12 @@
         </w:tc>
         <w:tc>
           <w:tcPr>
-            <w:tcW w:type="dxa" w:w="2268"/>
-          </w:tcPr>
-          <w:p>
-            <w:pPr>
-              <w:keepNext/>
-              <w:spacing w:after="40" w:before="40"/>
+            <w:tcW w:w="2268" w:type="dxa"/>
+          </w:tcPr>
+          <w:p>
+            <w:pPr>
+              <w:keepNext/>
+              <w:spacing w:before="40" w:after="40"/>
             </w:pPr>
             <w:r>
               <w:rPr>
@@ -2417,12 +2267,12 @@
         </w:tc>
         <w:tc>
           <w:tcPr>
-            <w:tcW w:type="dxa" w:w="2268"/>
-          </w:tcPr>
-          <w:p>
-            <w:pPr>
-              <w:keepNext/>
-              <w:spacing w:after="40" w:before="40"/>
+            <w:tcW w:w="2268" w:type="dxa"/>
+          </w:tcPr>
+          <w:p>
+            <w:pPr>
+              <w:keepNext/>
+              <w:spacing w:before="40" w:after="40"/>
             </w:pPr>
             <w:r>
               <w:rPr>
@@ -2439,13 +2289,13 @@
         </w:trPr>
         <w:tc>
           <w:tcPr>
-            <w:tcW w:type="dxa" w:w="2098"/>
+            <w:tcW w:w="2098" w:type="dxa"/>
             <w:shd w:val="clear" w:color="auto" w:fill="EAF1F8"/>
           </w:tcPr>
           <w:p>
             <w:pPr>
               <w:keepNext/>
-              <w:spacing w:after="40" w:before="40"/>
+              <w:spacing w:before="40" w:after="40"/>
             </w:pPr>
             <w:r>
               <w:rPr>
@@ -2464,12 +2314,12 @@
         </w:tc>
         <w:tc>
           <w:tcPr>
-            <w:tcW w:type="dxa" w:w="2381"/>
-          </w:tcPr>
-          <w:p>
-            <w:pPr>
-              <w:keepNext/>
-              <w:spacing w:after="40" w:before="40"/>
+            <w:tcW w:w="2381" w:type="dxa"/>
+          </w:tcPr>
+          <w:p>
+            <w:pPr>
+              <w:keepNext/>
+              <w:spacing w:before="40" w:after="40"/>
             </w:pPr>
             <w:r>
               <w:rPr>
@@ -2481,12 +2331,12 @@
         </w:tc>
         <w:tc>
           <w:tcPr>
-            <w:tcW w:type="dxa" w:w="2268"/>
-          </w:tcPr>
-          <w:p>
-            <w:pPr>
-              <w:keepNext/>
-              <w:spacing w:after="40" w:before="40"/>
+            <w:tcW w:w="2268" w:type="dxa"/>
+          </w:tcPr>
+          <w:p>
+            <w:pPr>
+              <w:keepNext/>
+              <w:spacing w:before="40" w:after="40"/>
             </w:pPr>
             <w:r>
               <w:rPr>
@@ -2498,12 +2348,12 @@
         </w:tc>
         <w:tc>
           <w:tcPr>
-            <w:tcW w:type="dxa" w:w="2268"/>
-          </w:tcPr>
-          <w:p>
-            <w:pPr>
-              <w:keepNext/>
-              <w:spacing w:after="40" w:before="40"/>
+            <w:tcW w:w="2268" w:type="dxa"/>
+          </w:tcPr>
+          <w:p>
+            <w:pPr>
+              <w:keepNext/>
+              <w:spacing w:before="40" w:after="40"/>
             </w:pPr>
             <w:r>
               <w:rPr>
@@ -2520,13 +2370,13 @@
         </w:trPr>
         <w:tc>
           <w:tcPr>
-            <w:tcW w:type="dxa" w:w="2098"/>
+            <w:tcW w:w="2098" w:type="dxa"/>
             <w:shd w:val="clear" w:color="auto" w:fill="EAF1F8"/>
           </w:tcPr>
           <w:p>
             <w:pPr>
               <w:keepNext/>
-              <w:spacing w:after="40" w:before="40"/>
+              <w:spacing w:before="40" w:after="40"/>
             </w:pPr>
             <w:r>
               <w:rPr>
@@ -2545,12 +2395,12 @@
         </w:tc>
         <w:tc>
           <w:tcPr>
-            <w:tcW w:type="dxa" w:w="2381"/>
-          </w:tcPr>
-          <w:p>
-            <w:pPr>
-              <w:keepNext/>
-              <w:spacing w:after="40" w:before="40"/>
+            <w:tcW w:w="2381" w:type="dxa"/>
+          </w:tcPr>
+          <w:p>
+            <w:pPr>
+              <w:keepNext/>
+              <w:spacing w:before="40" w:after="40"/>
             </w:pPr>
             <w:r>
               <w:rPr>
@@ -2562,12 +2412,12 @@
         </w:tc>
         <w:tc>
           <w:tcPr>
-            <w:tcW w:type="dxa" w:w="2268"/>
-          </w:tcPr>
-          <w:p>
-            <w:pPr>
-              <w:keepNext/>
-              <w:spacing w:after="40" w:before="40"/>
+            <w:tcW w:w="2268" w:type="dxa"/>
+          </w:tcPr>
+          <w:p>
+            <w:pPr>
+              <w:keepNext/>
+              <w:spacing w:before="40" w:after="40"/>
             </w:pPr>
             <w:r>
               <w:rPr>
@@ -2579,12 +2429,12 @@
         </w:tc>
         <w:tc>
           <w:tcPr>
-            <w:tcW w:type="dxa" w:w="2268"/>
-          </w:tcPr>
-          <w:p>
-            <w:pPr>
-              <w:keepNext/>
-              <w:spacing w:after="40" w:before="40"/>
+            <w:tcW w:w="2268" w:type="dxa"/>
+          </w:tcPr>
+          <w:p>
+            <w:pPr>
+              <w:keepNext/>
+              <w:spacing w:before="40" w:after="40"/>
             </w:pPr>
             <w:r>
               <w:rPr>
@@ -2601,13 +2451,13 @@
         </w:trPr>
         <w:tc>
           <w:tcPr>
-            <w:tcW w:type="dxa" w:w="2098"/>
+            <w:tcW w:w="2098" w:type="dxa"/>
             <w:shd w:val="clear" w:color="auto" w:fill="EAF1F8"/>
           </w:tcPr>
           <w:p>
             <w:pPr>
               <w:keepNext/>
-              <w:spacing w:after="40" w:before="40"/>
+              <w:spacing w:before="40" w:after="40"/>
             </w:pPr>
             <w:r>
               <w:rPr>
@@ -2626,12 +2476,12 @@
         </w:tc>
         <w:tc>
           <w:tcPr>
-            <w:tcW w:type="dxa" w:w="2381"/>
-          </w:tcPr>
-          <w:p>
-            <w:pPr>
-              <w:keepNext/>
-              <w:spacing w:after="40" w:before="40"/>
+            <w:tcW w:w="2381" w:type="dxa"/>
+          </w:tcPr>
+          <w:p>
+            <w:pPr>
+              <w:keepNext/>
+              <w:spacing w:before="40" w:after="40"/>
             </w:pPr>
             <w:r>
               <w:rPr>
@@ -2643,12 +2493,12 @@
         </w:tc>
         <w:tc>
           <w:tcPr>
-            <w:tcW w:type="dxa" w:w="2268"/>
-          </w:tcPr>
-          <w:p>
-            <w:pPr>
-              <w:keepNext/>
-              <w:spacing w:after="40" w:before="40"/>
+            <w:tcW w:w="2268" w:type="dxa"/>
+          </w:tcPr>
+          <w:p>
+            <w:pPr>
+              <w:keepNext/>
+              <w:spacing w:before="40" w:after="40"/>
             </w:pPr>
             <w:r>
               <w:rPr>
@@ -2660,12 +2510,12 @@
         </w:tc>
         <w:tc>
           <w:tcPr>
-            <w:tcW w:type="dxa" w:w="2268"/>
-          </w:tcPr>
-          <w:p>
-            <w:pPr>
-              <w:keepNext/>
-              <w:spacing w:after="40" w:before="40"/>
+            <w:tcW w:w="2268" w:type="dxa"/>
+          </w:tcPr>
+          <w:p>
+            <w:pPr>
+              <w:keepNext/>
+              <w:spacing w:before="40" w:after="40"/>
             </w:pPr>
             <w:r>
               <w:rPr>
@@ -2682,13 +2532,12 @@
         </w:trPr>
         <w:tc>
           <w:tcPr>
-            <w:tcW w:type="dxa" w:w="2098"/>
+            <w:tcW w:w="2098" w:type="dxa"/>
             <w:shd w:val="clear" w:color="auto" w:fill="EAF1F8"/>
           </w:tcPr>
           <w:p>
             <w:pPr>
-              <w:keepNext w:val="0"/>
-              <w:spacing w:after="40" w:before="40"/>
+              <w:spacing w:before="40" w:after="40"/>
             </w:pPr>
             <w:r>
               <w:rPr>
@@ -2707,12 +2556,11 @@
         </w:tc>
         <w:tc>
           <w:tcPr>
-            <w:tcW w:type="dxa" w:w="2381"/>
-          </w:tcPr>
-          <w:p>
-            <w:pPr>
-              <w:keepNext w:val="0"/>
-              <w:spacing w:after="40" w:before="40"/>
+            <w:tcW w:w="2381" w:type="dxa"/>
+          </w:tcPr>
+          <w:p>
+            <w:pPr>
+              <w:spacing w:before="40" w:after="40"/>
             </w:pPr>
             <w:r>
               <w:rPr>
@@ -2724,12 +2572,11 @@
         </w:tc>
         <w:tc>
           <w:tcPr>
-            <w:tcW w:type="dxa" w:w="2268"/>
-          </w:tcPr>
-          <w:p>
-            <w:pPr>
-              <w:keepNext w:val="0"/>
-              <w:spacing w:after="40" w:before="40"/>
+            <w:tcW w:w="2268" w:type="dxa"/>
+          </w:tcPr>
+          <w:p>
+            <w:pPr>
+              <w:spacing w:before="40" w:after="40"/>
             </w:pPr>
             <w:r>
               <w:rPr>
@@ -2741,12 +2588,11 @@
         </w:tc>
         <w:tc>
           <w:tcPr>
-            <w:tcW w:type="dxa" w:w="2268"/>
-          </w:tcPr>
-          <w:p>
-            <w:pPr>
-              <w:keepNext w:val="0"/>
-              <w:spacing w:after="40" w:before="40"/>
+            <w:tcW w:w="2268" w:type="dxa"/>
+          </w:tcPr>
+          <w:p>
+            <w:pPr>
+              <w:spacing w:before="40" w:after="40"/>
             </w:pPr>
             <w:r>
               <w:rPr>
@@ -2758,11 +2604,7 @@
         </w:tc>
       </w:tr>
     </w:tbl>
-    <w:p>
-      <w:pPr>
-        <w:spacing w:after="0"/>
-      </w:pPr>
-    </w:p>
+    <w:p/>
     <w:p>
       <w:pPr>
         <w:pStyle w:val="Ttulo1"/>
@@ -2774,128 +2616,112 @@
     <w:p>
       <w:pPr>
         <w:tabs>
-          <w:tab w:pos="567" w:val="left"/>
+          <w:tab w:val="left" w:pos="567"/>
         </w:tabs>
-        <w:spacing w:before="0" w:after="60" w:line="300" w:lineRule="auto"/>
+        <w:spacing w:after="60" w:line="300" w:lineRule="auto"/>
         <w:ind w:left="567" w:hanging="567"/>
       </w:pPr>
       <w:r>
         <w:t>☐</w:t>
+      </w:r>
+      <w:r>
         <w:tab/>
-      </w:r>
-      <w:r>
         <w:t>O filme está identificado na capa e na introdução.</w:t>
       </w:r>
     </w:p>
     <w:p>
       <w:pPr>
         <w:tabs>
-          <w:tab w:pos="567" w:val="left"/>
+          <w:tab w:val="left" w:pos="567"/>
         </w:tabs>
-        <w:spacing w:before="0" w:after="60" w:line="300" w:lineRule="auto"/>
+        <w:spacing w:after="60" w:line="300" w:lineRule="auto"/>
         <w:ind w:left="567" w:hanging="567"/>
       </w:pPr>
       <w:r>
         <w:t>☐</w:t>
+      </w:r>
+      <w:r>
         <w:tab/>
-      </w:r>
-      <w:r>
         <w:t>Há pelo menos 4 conceitos, de pelo menos 3 aulas diferentes.</w:t>
       </w:r>
     </w:p>
     <w:p>
       <w:pPr>
         <w:tabs>
-          <w:tab w:pos="567" w:val="left"/>
+          <w:tab w:val="left" w:pos="567"/>
         </w:tabs>
-        <w:spacing w:before="0" w:after="60" w:line="300" w:lineRule="auto"/>
+        <w:spacing w:after="60" w:line="300" w:lineRule="auto"/>
         <w:ind w:left="567" w:hanging="567"/>
       </w:pPr>
       <w:r>
         <w:t>☐</w:t>
+      </w:r>
+      <w:r>
         <w:tab/>
-      </w:r>
-      <w:r>
         <w:t>Cada conceito está definido e citado antes de ser aplicado.</w:t>
       </w:r>
     </w:p>
     <w:p>
       <w:pPr>
         <w:tabs>
-          <w:tab w:pos="567" w:val="left"/>
+          <w:tab w:val="left" w:pos="567"/>
         </w:tabs>
-        <w:spacing w:before="0" w:after="60" w:line="300" w:lineRule="auto"/>
+        <w:spacing w:after="60" w:line="300" w:lineRule="auto"/>
         <w:ind w:left="567" w:hanging="567"/>
       </w:pPr>
       <w:r>
         <w:t>☐</w:t>
+      </w:r>
+      <w:r>
         <w:tab/>
-      </w:r>
-      <w:r>
         <w:t>Há pelo menos uma análise funcional completa: antecedente, resposta e consequência.</w:t>
       </w:r>
     </w:p>
     <w:p>
       <w:pPr>
         <w:tabs>
-          <w:tab w:pos="567" w:val="left"/>
+          <w:tab w:val="left" w:pos="567"/>
         </w:tabs>
-        <w:spacing w:before="0" w:after="60" w:line="300" w:lineRule="auto"/>
+        <w:spacing w:after="60" w:line="300" w:lineRule="auto"/>
         <w:ind w:left="567" w:hanging="567"/>
       </w:pPr>
       <w:r>
         <w:t>☐</w:t>
+      </w:r>
+      <w:r>
         <w:tab/>
-      </w:r>
-      <w:r>
-        <w:t>Cada cena tem minutagem.</w:t>
+        <w:t>A discussão crítica vai além da opinião pessoal.</w:t>
       </w:r>
     </w:p>
     <w:p>
       <w:pPr>
         <w:tabs>
-          <w:tab w:pos="567" w:val="left"/>
+          <w:tab w:val="left" w:pos="567"/>
         </w:tabs>
-        <w:spacing w:before="0" w:after="60" w:line="300" w:lineRule="auto"/>
+        <w:spacing w:after="60" w:line="300" w:lineRule="auto"/>
         <w:ind w:left="567" w:hanging="567"/>
       </w:pPr>
       <w:r>
         <w:t>☐</w:t>
+      </w:r>
+      <w:r>
         <w:tab/>
-      </w:r>
-      <w:r>
-        <w:t>A discussão crítica vai além da opinião pessoal.</w:t>
+        <w:t>O texto tem de 5 a 8 páginas, em ABNT, e as referências estão no fim.</w:t>
       </w:r>
     </w:p>
     <w:p>
       <w:pPr>
         <w:tabs>
-          <w:tab w:pos="567" w:val="left"/>
+          <w:tab w:val="left" w:pos="567"/>
         </w:tabs>
-        <w:spacing w:before="0" w:after="60" w:line="300" w:lineRule="auto"/>
+        <w:spacing w:after="60" w:line="300" w:lineRule="auto"/>
         <w:ind w:left="567" w:hanging="567"/>
       </w:pPr>
       <w:r>
         <w:t>☐</w:t>
+      </w:r>
+      <w:r>
         <w:tab/>
-      </w:r>
-      <w:r>
-        <w:t>O texto tem de 5 a 8 páginas, em ABNT, e as referências estão no fim.</w:t>
-      </w:r>
-    </w:p>
-    <w:p>
-      <w:pPr>
-        <w:tabs>
-          <w:tab w:pos="567" w:val="left"/>
-        </w:tabs>
-        <w:spacing w:before="0" w:after="60" w:line="300" w:lineRule="auto"/>
-        <w:ind w:left="567" w:hanging="567"/>
-      </w:pPr>
-      <w:r>
-        <w:t>☐</w:t>
-        <w:tab/>
-      </w:r>
-      <w:r>
         <w:t>O arquivo está em PDF, com o nome no formato pedido.</w:t>
       </w:r>
     </w:p>

</xml_diff>